<commit_message>
Logga omskrivningen av Vadstället
</commit_message>
<xml_diff>
--- a/texter/Vadstället.docx
+++ b/texter/Vadstället.docx
@@ -18,6 +18,33 @@
           <w:lang w:val="sv-SE"/>
         </w:rPr>
         <w:t xml:space="preserve">Vadstället</w:t>
+      </w:r>
+      <w:r>
+        <w:rPr>
+          <w:lang w:val="sv-SE"/>
+        </w:rPr>
+      </w:r>
+    </w:p>
+    <w:p>
+      <w:pPr>
+        <w:pBdr/>
+        <w:spacing/>
+        <w:ind/>
+        <w:rPr>
+          <w:lang w:val="sv-SE"/>
+        </w:rPr>
+      </w:pPr>
+      <w:r>
+        <w:rPr>
+          <w:color w:val="000000" w:themeColor="text1"/>
+          <w:lang w:val="sv-SE" w:bidi="sv-SE"/>
+        </w:rPr>
+        <w:t xml:space="preserve">&lt;FirstDraft&gt;</w:t>
+      </w:r>
+      <w:r>
+        <w:rPr>
+          <w:lang w:val="sv-SE"/>
+        </w:rPr>
       </w:r>
       <w:r>
         <w:rPr>
@@ -303,7 +330,7 @@
           <w:highlight w:val="none"/>
           <w:lang w:val="sv-SE" w:bidi="sv-SE"/>
         </w:rPr>
-        <w:t xml:space="preserve">stelnade till när han såg sin lärling häva upp prinsessan i sin famn. Till och med prinsessans spröda figur var för mycket för Remas klena kroppsbyggnad. Rema stapplade när han tog sig fram mot hästen. Han försökte häva upp Lyris överkropp på hästens rygg men kämpade förgäves. </w:t>
+        <w:t xml:space="preserve">stelnade till när han såg sin lärling häva upp prinsessan i sin famn. Till och med prinsessans spröda figur var för mycket för Ramas klena kroppsbyggnad. Rama stapplade när han tog sig fram mot hästen. Han försökte häva upp Lyris överkropp på hästens rygg men kämpade förgäves. </w:t>
       </w:r>
       <w:r>
         <w:rPr>
@@ -330,7 +357,7 @@
           <w:highlight w:val="none"/>
           <w:lang w:val="sv-SE" w:bidi="sv-SE"/>
         </w:rPr>
-        <w:t xml:space="preserve">Hjälp, skrek Rema. Hjälp mig få upp henne.</w:t>
+        <w:t xml:space="preserve">Hjälp, skrek Rama. Hjälp mig få upp henne.</w:t>
       </w:r>
       <w:r>
         <w:rPr>
@@ -438,7 +465,7 @@
           <w:highlight w:val="none"/>
           <w:lang w:val="sv-SE" w:bidi="sv-SE"/>
         </w:rPr>
-        <w:t xml:space="preserve">Du får följa med, sa Rema och Pjotr misstänkte att vattnet som stänkt ned dem dolde Remas tårar. </w:t>
+        <w:t xml:space="preserve">Du får följa med, sa Rama och Pjotr misstänkte att vattnet som stänkt ned dem dolde Ramas tårar. </w:t>
       </w:r>
       <w:r>
         <w:rPr>
@@ -542,7 +569,7 @@
           <w:highlight w:val="none"/>
           <w:lang w:val="sv-SE" w:bidi="sv-SE"/>
         </w:rPr>
-        <w:t xml:space="preserve">Pjotr stegade fram och ryckte prinsessan ur Remas famn och kastade upp henne på Argos rygg. Han hade varit soldat i hela sitt liv. Hela sitt liv hade han burit rustningar, vapen, stenar till krigsmaskiner och utkämpat slag som varit i timmar. Rema var bara en vanlig pojk. Vanlig fast ovanligt klen. Och en ovanligt skicklig fäktare. </w:t>
+        <w:t xml:space="preserve">Pjotr stegade fram och ryckte prinsessan ur Ramas famn och kastade upp henne på Argos rygg. Han hade varit soldat i hela sitt liv. Hela sitt liv hade han burit rustningar, vapen, stenar till krigsmaskiner och utkämpat slag som varit i timmar. Rama var bara en vanlig pojk. Vanlig fast ovanligt klen. Och en ovanligt skicklig fäktare. </w:t>
       </w:r>
       <w:r>
         <w:rPr>
@@ -596,7 +623,7 @@
           <w:highlight w:val="none"/>
           <w:lang w:val="sv-SE" w:bidi="sv-SE"/>
         </w:rPr>
-        <w:t xml:space="preserve">Ja, svarade Rema med en röst Pjotr inte hörde, men Pjotr hade inte heller ställt en fråga.</w:t>
+        <w:t xml:space="preserve">Ja, svarade Rama med en röst Pjotr inte hörde, men Pjotr hade inte heller ställt en fråga.</w:t>
       </w:r>
       <w:r>
         <w:rPr>
@@ -610,7 +637,8 @@
         <w:spacing/>
         <w:ind w:firstLine="0" w:left="0"/>
         <w:rPr>
-          <w:lang w:val="sv-SE"/>
+          <w:highlight w:val="none"/>
+          <w:lang w:val="sv-SE" w:bidi="sv-SE"/>
         </w:rPr>
       </w:pPr>
       <w:r>
@@ -618,7 +646,1000 @@
           <w:highlight w:val="none"/>
           <w:lang w:val="sv-SE" w:bidi="sv-SE"/>
         </w:rPr>
-        <w:t xml:space="preserve">Rema gick bort mot andra änden av vadstället och Pjotr tryckte sitt ansikte mot Rygars. Argos var den kraftigare hästen men Rygar var hans. Pjotr viskade på språket bara Rygar förstod och lät axlarna falla. Han såg bort mot Rema och tog ett steg mot honom när han såg honom snava men hejdade sig. Hans grepp hårdnade om Rygars man och han naglade fast blicken i ryggen på sin älskade lärling. Han önskade att han kunnat prygla honom med ögonen. Han önskade att han kunde torka bort hans tårar. Rema nådde den bortre stranden och vände blicken mot sin mästare. Pjotr lade sin knutna näve mot bröstet i den hälsning som användes mot jämbördiga. Rema höjde sin hand i hälsningen som används mot kunglighet. Pjotr ledde Rygar tillbaka och satt upp. Han slöt sina ögon och lät ögonlocken blicka upp mot himlen. Sedan drog han sitt svärd och red.</w:t>
+        <w:t xml:space="preserve">Rama gick bort mot andra änden av vadstället och Pjotr tryckte sitt ansikte mot Rygars. Argos var den kraftigare hästen men Rygar var hans. Pjotr viskade på språket bara Rygar förstod och lät axlarna falla. Han såg bort mot Rama och tog ett steg mot honom när han såg honom snava men hejdade sig. Hans grepp hårdnade om Rygars man och han naglade fast blicken i ryggen på sin älskade lärling. Han önskade att han kunnat prygla honom med ögonen. Han önskade att han kunde torka bort hans tårar. Rama nådde den bortre stranden och vände blicken mot sin mästare. Pjotr lade sin knutna näve mot bröstet i den hälsning som användes mot jämbördiga. Rama höjde sin hand i hälsningen som används mot kunglighet. Pjotr ledde Rygar tillbaka och satt upp. Han slöt sina ögon och lät ögonlocken blicka upp mot himlen. Sedan drog han sitt svärd och red.</w:t>
+      </w:r>
+      <w:r>
+        <w:rPr>
+          <w:lang w:val="sv-SE"/>
+        </w:rPr>
+      </w:r>
+    </w:p>
+    <w:p>
+      <w:pPr>
+        <w:pBdr/>
+        <w:spacing/>
+        <w:ind w:firstLine="0" w:left="0"/>
+        <w:rPr>
+          <w:highlight w:val="none"/>
+          <w:lang w:val="sv-SE" w:bidi="sv-SE"/>
+        </w:rPr>
+      </w:pPr>
+      <w:r>
+        <w:rPr>
+          <w:highlight w:val="none"/>
+          <w:lang w:val="sv-SE" w:bidi="sv-SE"/>
+        </w:rPr>
+      </w:r>
+      <w:r>
+        <w:rPr>
+          <w:color w:val="000000" w:themeColor="text1"/>
+          <w:lang w:val="sv-SE" w:bidi="sv-SE"/>
+        </w:rPr>
+        <w:t xml:space="preserve">&lt;/FirstDraft&gt;</w:t>
+      </w:r>
+      <w:r/>
+      <w:r>
+        <w:rPr>
+          <w:highlight w:val="none"/>
+          <w:lang w:val="sv-SE" w:bidi="sv-SE"/>
+        </w:rPr>
+      </w:r>
+      <w:r>
+        <w:rPr>
+          <w:highlight w:val="none"/>
+          <w:lang w:val="sv-SE" w:bidi="sv-SE"/>
+        </w:rPr>
+      </w:r>
+      <w:r>
+        <w:rPr>
+          <w:lang w:val="sv-SE"/>
+        </w:rPr>
+      </w:r>
+    </w:p>
+    <w:p>
+      <w:pPr>
+        <w:pBdr/>
+        <w:spacing/>
+        <w:ind/>
+        <w:rPr>
+          <w:lang w:val="sv-SE"/>
+        </w:rPr>
+      </w:pPr>
+      <w:r>
+        <w:rPr>
+          <w:color w:val="000000" w:themeColor="text1"/>
+          <w:lang w:val="sv-SE" w:bidi="sv-SE"/>
+        </w:rPr>
+        <w:t xml:space="preserve">&lt;SecondDraft&gt;</w:t>
+      </w:r>
+      <w:r>
+        <w:rPr>
+          <w:lang w:val="sv-SE"/>
+        </w:rPr>
+      </w:r>
+      <w:r>
+        <w:rPr>
+          <w:lang w:val="sv-SE"/>
+        </w:rPr>
+      </w:r>
+    </w:p>
+    <w:p>
+      <w:pPr>
+        <w:pBdr/>
+        <w:spacing/>
+        <w:ind/>
+        <w:rPr>
+          <w:highlight w:val="none"/>
+          <w:lang w:val="sv-SE" w:bidi="sv-SE"/>
+        </w:rPr>
+      </w:pPr>
+      <w:r>
+        <w:rPr>
+          <w:color w:val="000000" w:themeColor="text1"/>
+          <w:lang w:val="sv-SE" w:bidi="sv-SE"/>
+        </w:rPr>
+      </w:r>
+      <w:r>
+        <w:rPr>
+          <w:lang w:val="sv-SE" w:bidi="sv-SE"/>
+        </w:rPr>
+        <w:t xml:space="preserve">Pjotr drev på hästarna, desperationen drev på Pjotr.</w:t>
+      </w:r>
+      <w:r>
+        <w:rPr>
+          <w:highlight w:val="none"/>
+          <w:lang w:val="sv-SE" w:bidi="sv-SE"/>
+        </w:rPr>
+      </w:r>
+      <w:r>
+        <w:rPr>
+          <w:highlight w:val="none"/>
+          <w:lang w:val="sv-SE" w:bidi="sv-SE"/>
+        </w:rPr>
+      </w:r>
+    </w:p>
+    <w:p>
+      <w:pPr>
+        <w:pStyle w:val="668"/>
+        <w:numPr>
+          <w:ilvl w:val="0"/>
+          <w:numId w:val="6"/>
+        </w:numPr>
+        <w:pBdr/>
+        <w:spacing/>
+        <w:ind/>
+        <w:rPr>
+          <w:lang w:val="sv-SE"/>
+        </w:rPr>
+      </w:pPr>
+      <w:r>
+        <w:rPr>
+          <w:highlight w:val="none"/>
+          <w:lang w:val="sv-SE" w:bidi="sv-SE"/>
+        </w:rPr>
+        <w:t xml:space="preserve">Vattnet har stigit för mycket, skrek Rama, stanna!</w:t>
+      </w:r>
+      <w:r>
+        <w:rPr>
+          <w:lang w:val="sv-SE"/>
+        </w:rPr>
+      </w:r>
+      <w:r>
+        <w:rPr>
+          <w:lang w:val="sv-SE"/>
+        </w:rPr>
+      </w:r>
+    </w:p>
+    <w:p>
+      <w:pPr>
+        <w:pStyle w:val="668"/>
+        <w:numPr>
+          <w:ilvl w:val="0"/>
+          <w:numId w:val="6"/>
+        </w:numPr>
+        <w:pBdr/>
+        <w:spacing/>
+        <w:ind/>
+        <w:rPr>
+          <w:lang w:val="sv-SE"/>
+        </w:rPr>
+      </w:pPr>
+      <w:r>
+        <w:rPr>
+          <w:highlight w:val="none"/>
+          <w:lang w:val="sv-SE" w:bidi="sv-SE"/>
+        </w:rPr>
+        <w:t xml:space="preserve">Vi kan inte stanna, håll i er!</w:t>
+      </w:r>
+      <w:r>
+        <w:rPr>
+          <w:lang w:val="sv-SE"/>
+        </w:rPr>
+      </w:r>
+      <w:r>
+        <w:rPr>
+          <w:lang w:val="sv-SE"/>
+        </w:rPr>
+      </w:r>
+    </w:p>
+    <w:p>
+      <w:pPr>
+        <w:pBdr/>
+        <w:spacing/>
+        <w:ind w:firstLine="0" w:left="0"/>
+        <w:rPr>
+          <w:highlight w:val="none"/>
+          <w:lang w:val="sv-SE" w:bidi="sv-SE"/>
+        </w:rPr>
+      </w:pPr>
+      <w:r>
+        <w:rPr>
+          <w:highlight w:val="none"/>
+          <w:lang w:val="sv-SE" w:bidi="sv-SE"/>
+        </w:rPr>
+        <w:t xml:space="preserve">Pjotr piskade hästarna och tvingade dem att trotsa sina instin</w:t>
+      </w:r>
+      <w:r>
+        <w:rPr>
+          <w:highlight w:val="none"/>
+          <w:lang w:val="sv-SE" w:bidi="sv-SE"/>
+        </w:rPr>
+        <w:t xml:space="preserve">kter. De galopperade över vadstället där vattnet nu stigit så högt att det täckte hästarnas ben. Vattnet stänkte ner Pjotr, Rama och deras last, prinsessan Lyri. I vanliga fall var vadstället en besvärlig passage, men nu när vattnet stigit en omöjlig. Häst</w:t>
+      </w:r>
+      <w:r>
+        <w:rPr>
+          <w:highlight w:val="none"/>
+          <w:lang w:val="sv-SE" w:bidi="sv-SE"/>
+        </w:rPr>
+        <w:t xml:space="preserve">arna drev på med en kraft värdig deras kungliga blodslinje men terrängen lät sig inte besegras på samma sätt som inte ens kungliga stenar flyter. Med en kraftig stöt krängde vagnen till och ekipaget gjorde halt. Ena hjulet hade slagits sönder mot en sten. </w:t>
+      </w:r>
+      <w:r>
+        <w:rPr>
+          <w:highlight w:val="none"/>
+          <w:lang w:val="sv-SE" w:bidi="sv-SE"/>
+        </w:rPr>
+      </w:r>
+      <w:r>
+        <w:rPr>
+          <w:highlight w:val="none"/>
+          <w:lang w:val="sv-SE" w:bidi="sv-SE"/>
+        </w:rPr>
+      </w:r>
+    </w:p>
+    <w:p>
+      <w:pPr>
+        <w:pStyle w:val="668"/>
+        <w:numPr>
+          <w:ilvl w:val="0"/>
+          <w:numId w:val="7"/>
+        </w:numPr>
+        <w:pBdr/>
+        <w:spacing/>
+        <w:ind/>
+        <w:rPr>
+          <w:lang w:val="sv-SE"/>
+        </w:rPr>
+      </w:pPr>
+      <w:r>
+        <w:rPr>
+          <w:highlight w:val="none"/>
+          <w:lang w:val="sv-SE" w:bidi="sv-SE"/>
+        </w:rPr>
+        <w:t xml:space="preserve">Spänn loss hästarna! Du leder Argos över och tar med dig Lyri och rider till palatset. Jag tar Rygar och uppehåller Hallas män, röt Pjotr med myndighet i rösten.</w:t>
+      </w:r>
+      <w:r>
+        <w:rPr>
+          <w:lang w:val="sv-SE"/>
+        </w:rPr>
+      </w:r>
+      <w:r>
+        <w:rPr>
+          <w:lang w:val="sv-SE"/>
+        </w:rPr>
+      </w:r>
+    </w:p>
+    <w:p>
+      <w:pPr>
+        <w:pStyle w:val="668"/>
+        <w:numPr>
+          <w:ilvl w:val="0"/>
+          <w:numId w:val="7"/>
+        </w:numPr>
+        <w:pBdr/>
+        <w:spacing/>
+        <w:ind/>
+        <w:rPr>
+          <w:lang w:val="sv-SE"/>
+        </w:rPr>
+      </w:pPr>
+      <w:r>
+        <w:rPr>
+          <w:highlight w:val="none"/>
+          <w:lang w:val="sv-SE" w:bidi="sv-SE"/>
+        </w:rPr>
+        <w:t xml:space="preserve">Vi rider tillsammans, sa Rama, följ med oss. Vi hinner före dem till palatset.</w:t>
+      </w:r>
+      <w:r>
+        <w:rPr>
+          <w:lang w:val="sv-SE"/>
+        </w:rPr>
+      </w:r>
+      <w:r>
+        <w:rPr>
+          <w:lang w:val="sv-SE"/>
+        </w:rPr>
+      </w:r>
+    </w:p>
+    <w:p>
+      <w:pPr>
+        <w:pStyle w:val="668"/>
+        <w:numPr>
+          <w:ilvl w:val="0"/>
+          <w:numId w:val="7"/>
+        </w:numPr>
+        <w:pBdr/>
+        <w:spacing/>
+        <w:ind/>
+        <w:rPr>
+          <w:lang w:val="sv-SE"/>
+        </w:rPr>
+      </w:pPr>
+      <w:r>
+        <w:rPr>
+          <w:highlight w:val="none"/>
+          <w:lang w:val="sv-SE" w:bidi="sv-SE"/>
+        </w:rPr>
+        <w:t xml:space="preserve">Nej. Det gör vi inte. Argos och Rygar har utmanat alla legender och segrat genom att ta oss såhär långt. I sitt nuvarande skick kan inte ens Argos hålla ifrån. </w:t>
+      </w:r>
+      <w:r>
+        <w:rPr>
+          <w:lang w:val="sv-SE"/>
+        </w:rPr>
+      </w:r>
+      <w:r>
+        <w:rPr>
+          <w:lang w:val="sv-SE"/>
+        </w:rPr>
+      </w:r>
+    </w:p>
+    <w:p>
+      <w:pPr>
+        <w:pBdr/>
+        <w:spacing/>
+        <w:ind/>
+        <w:rPr>
+          <w:highlight w:val="none"/>
+          <w:lang w:val="sv-SE" w:bidi="sv-SE"/>
+        </w:rPr>
+      </w:pPr>
+      <w:r>
+        <w:rPr>
+          <w:highlight w:val="none"/>
+          <w:lang w:val="sv-SE" w:bidi="sv-SE"/>
+        </w:rPr>
+        <w:t xml:space="preserve">Vattnet steg och för varje ögonblick kom deras efterföljare närmare. </w:t>
+      </w:r>
+      <w:r>
+        <w:rPr>
+          <w:highlight w:val="none"/>
+          <w:lang w:val="sv-SE" w:bidi="sv-SE"/>
+        </w:rPr>
+        <w:t xml:space="preserve">De spände snabbt av den trasiga vagnen och hästarn</w:t>
+      </w:r>
+      <w:r>
+        <w:rPr>
+          <w:highlight w:val="none"/>
+          <w:lang w:val="sv-SE" w:bidi="sv-SE"/>
+        </w:rPr>
+        <w:t xml:space="preserve">a gnäggade när de lyfte av däckeln. Skaklarna låg redan under vatten så de föll ljudlöst ned. Fradgan täckte hästarnas mular men de bar sina huvuden högt. Deras hållning vittnade om att de skulle dö av utmattning eller svärd hellre än att svika sin plikt. </w:t>
+      </w:r>
+      <w:r>
+        <w:rPr>
+          <w:highlight w:val="none"/>
+          <w:lang w:val="sv-SE" w:bidi="sv-SE"/>
+        </w:rPr>
+        <w:t xml:space="preserve">Lyri låg fortfarande medvetslös i den lutande vagnen. </w:t>
+      </w:r>
+      <w:r>
+        <w:rPr>
+          <w:highlight w:val="none"/>
+          <w:lang w:val="sv-SE" w:bidi="sv-SE"/>
+        </w:rPr>
+      </w:r>
+      <w:r>
+        <w:rPr>
+          <w:highlight w:val="none"/>
+          <w:lang w:val="sv-SE" w:bidi="sv-SE"/>
+        </w:rPr>
+      </w:r>
+    </w:p>
+    <w:p>
+      <w:pPr>
+        <w:pStyle w:val="668"/>
+        <w:numPr>
+          <w:ilvl w:val="0"/>
+          <w:numId w:val="8"/>
+        </w:numPr>
+        <w:pBdr/>
+        <w:spacing/>
+        <w:ind/>
+        <w:rPr>
+          <w:lang w:val="sv-SE"/>
+        </w:rPr>
+      </w:pPr>
+      <w:r>
+        <w:rPr>
+          <w:highlight w:val="none"/>
+          <w:lang w:val="sv-SE" w:bidi="sv-SE"/>
+        </w:rPr>
+        <w:t xml:space="preserve">Lyft upp henne på Argos nu, beordrade Pjotr.</w:t>
+      </w:r>
+      <w:r>
+        <w:rPr>
+          <w:lang w:val="sv-SE"/>
+        </w:rPr>
+      </w:r>
+      <w:r>
+        <w:rPr>
+          <w:lang w:val="sv-SE"/>
+        </w:rPr>
+      </w:r>
+    </w:p>
+    <w:p>
+      <w:pPr>
+        <w:pBdr/>
+        <w:spacing/>
+        <w:ind w:firstLine="0" w:left="0"/>
+        <w:rPr>
+          <w:highlight w:val="none"/>
+          <w:lang w:val="sv-SE" w:bidi="sv-SE"/>
+        </w:rPr>
+      </w:pPr>
+      <w:r>
+        <w:rPr>
+          <w:highlight w:val="none"/>
+          <w:lang w:val="sv-SE" w:bidi="sv-SE"/>
+        </w:rPr>
+        <w:t xml:space="preserve">Pjotr </w:t>
+      </w:r>
+      <w:r>
+        <w:rPr>
+          <w:highlight w:val="none"/>
+          <w:lang w:val="sv-SE" w:bidi="sv-SE"/>
+        </w:rPr>
+        <w:t xml:space="preserve">stelnade till när han </w:t>
+      </w:r>
+      <w:r>
+        <w:rPr>
+          <w:highlight w:val="none"/>
+          <w:lang w:val="sv-SE" w:bidi="sv-SE"/>
+        </w:rPr>
+        <w:t xml:space="preserve">såg sin lärling häva upp prinsessan i sin famn. Till och med prinsessans spröda figur var för mycket för Ramas klena kroppsbyggnad. Rama stapplade när han tog sig fram mot hästen. Han försökte häva upp Lyris överkropp på hästens rygg men kämpade förgäves. </w:t>
+      </w:r>
+      <w:r>
+        <w:rPr>
+          <w:highlight w:val="none"/>
+          <w:lang w:val="sv-SE" w:bidi="sv-SE"/>
+        </w:rPr>
+      </w:r>
+      <w:r>
+        <w:rPr>
+          <w:highlight w:val="none"/>
+          <w:lang w:val="sv-SE" w:bidi="sv-SE"/>
+        </w:rPr>
+      </w:r>
+    </w:p>
+    <w:p>
+      <w:pPr>
+        <w:pStyle w:val="668"/>
+        <w:numPr>
+          <w:ilvl w:val="0"/>
+          <w:numId w:val="9"/>
+        </w:numPr>
+        <w:pBdr/>
+        <w:spacing/>
+        <w:ind/>
+        <w:rPr>
+          <w:lang w:val="sv-SE"/>
+        </w:rPr>
+      </w:pPr>
+      <w:r>
+        <w:rPr>
+          <w:highlight w:val="none"/>
+          <w:lang w:val="sv-SE" w:bidi="sv-SE"/>
+        </w:rPr>
+        <w:t xml:space="preserve">Hjälp, skrek Rama. Hjälp mig få upp henne.</w:t>
+      </w:r>
+      <w:r>
+        <w:rPr>
+          <w:lang w:val="sv-SE"/>
+        </w:rPr>
+      </w:r>
+      <w:r>
+        <w:rPr>
+          <w:lang w:val="sv-SE"/>
+        </w:rPr>
+      </w:r>
+    </w:p>
+    <w:p>
+      <w:pPr>
+        <w:pStyle w:val="668"/>
+        <w:numPr>
+          <w:ilvl w:val="0"/>
+          <w:numId w:val="9"/>
+        </w:numPr>
+        <w:pBdr/>
+        <w:spacing/>
+        <w:ind/>
+        <w:rPr>
+          <w:lang w:val="sv-SE"/>
+        </w:rPr>
+      </w:pPr>
+      <w:r>
+        <w:rPr>
+          <w:highlight w:val="none"/>
+          <w:lang w:val="sv-SE" w:bidi="sv-SE"/>
+        </w:rPr>
+        <w:t xml:space="preserve">Nej! Du måste klara det.</w:t>
+      </w:r>
+      <w:r>
+        <w:rPr>
+          <w:lang w:val="sv-SE"/>
+        </w:rPr>
+      </w:r>
+      <w:r>
+        <w:rPr>
+          <w:lang w:val="sv-SE"/>
+        </w:rPr>
+      </w:r>
+    </w:p>
+    <w:p>
+      <w:pPr>
+        <w:pStyle w:val="668"/>
+        <w:numPr>
+          <w:ilvl w:val="0"/>
+          <w:numId w:val="9"/>
+        </w:numPr>
+        <w:pBdr/>
+        <w:spacing/>
+        <w:ind/>
+        <w:rPr>
+          <w:lang w:val="sv-SE"/>
+        </w:rPr>
+      </w:pPr>
+      <w:r>
+        <w:rPr>
+          <w:highlight w:val="none"/>
+          <w:lang w:val="sv-SE" w:bidi="sv-SE"/>
+        </w:rPr>
+        <w:t xml:space="preserve">Hon är för tung. Jag får inte upp henne.</w:t>
+      </w:r>
+      <w:r>
+        <w:rPr>
+          <w:lang w:val="sv-SE"/>
+        </w:rPr>
+      </w:r>
+      <w:r>
+        <w:rPr>
+          <w:lang w:val="sv-SE"/>
+        </w:rPr>
+      </w:r>
+    </w:p>
+    <w:p>
+      <w:pPr>
+        <w:pStyle w:val="668"/>
+        <w:numPr>
+          <w:ilvl w:val="0"/>
+          <w:numId w:val="9"/>
+        </w:numPr>
+        <w:pBdr/>
+        <w:spacing/>
+        <w:ind/>
+        <w:rPr>
+          <w:lang w:val="sv-SE"/>
+        </w:rPr>
+      </w:pPr>
+      <w:r>
+        <w:rPr>
+          <w:highlight w:val="none"/>
+          <w:lang w:val="sv-SE" w:bidi="sv-SE"/>
+        </w:rPr>
+        <w:t xml:space="preserve">Och om hon faller när ni rider själva, hur ska du göra då? Ska du lägga dig bredvid henne och invänta döden då? Och rikets fall?</w:t>
+      </w:r>
+      <w:r>
+        <w:rPr>
+          <w:lang w:val="sv-SE"/>
+        </w:rPr>
+      </w:r>
+      <w:r>
+        <w:rPr>
+          <w:lang w:val="sv-SE"/>
+        </w:rPr>
+      </w:r>
+    </w:p>
+    <w:p>
+      <w:pPr>
+        <w:pStyle w:val="668"/>
+        <w:numPr>
+          <w:ilvl w:val="0"/>
+          <w:numId w:val="9"/>
+        </w:numPr>
+        <w:pBdr/>
+        <w:spacing/>
+        <w:ind/>
+        <w:rPr>
+          <w:lang w:val="sv-SE"/>
+        </w:rPr>
+      </w:pPr>
+      <w:r>
+        <w:rPr>
+          <w:highlight w:val="none"/>
+          <w:lang w:val="sv-SE" w:bidi="sv-SE"/>
+        </w:rPr>
+        <w:t xml:space="preserve">Du får följa med, sa Rama och Pjotr misstänkte att vattnet som stänkt ned dem dolde Ramas tårar. </w:t>
+      </w:r>
+      <w:r>
+        <w:rPr>
+          <w:lang w:val="sv-SE"/>
+        </w:rPr>
+      </w:r>
+      <w:r>
+        <w:rPr>
+          <w:lang w:val="sv-SE"/>
+        </w:rPr>
+      </w:r>
+    </w:p>
+    <w:p>
+      <w:pPr>
+        <w:pStyle w:val="668"/>
+        <w:numPr>
+          <w:ilvl w:val="0"/>
+          <w:numId w:val="9"/>
+        </w:numPr>
+        <w:pBdr/>
+        <w:spacing/>
+        <w:ind/>
+        <w:rPr>
+          <w:lang w:val="sv-SE"/>
+        </w:rPr>
+      </w:pPr>
+      <w:r>
+        <w:rPr>
+          <w:highlight w:val="none"/>
+          <w:lang w:val="sv-SE" w:bidi="sv-SE"/>
+        </w:rPr>
+        <w:t xml:space="preserve">Har du inte hört? Om vi rider tillsammans kommer de ikapp oss. </w:t>
+      </w:r>
+      <w:r>
+        <w:rPr>
+          <w:lang w:val="sv-SE"/>
+        </w:rPr>
+      </w:r>
+      <w:r>
+        <w:rPr>
+          <w:lang w:val="sv-SE"/>
+        </w:rPr>
+      </w:r>
+    </w:p>
+    <w:p>
+      <w:pPr>
+        <w:pStyle w:val="668"/>
+        <w:numPr>
+          <w:ilvl w:val="0"/>
+          <w:numId w:val="9"/>
+        </w:numPr>
+        <w:pBdr/>
+        <w:spacing/>
+        <w:ind/>
+        <w:rPr>
+          <w:lang w:val="sv-SE"/>
+        </w:rPr>
+      </w:pPr>
+      <w:r>
+        <w:rPr>
+          <w:highlight w:val="none"/>
+          <w:lang w:val="sv-SE" w:bidi="sv-SE"/>
+        </w:rPr>
+        <w:t xml:space="preserve">Du måste..</w:t>
+      </w:r>
+      <w:r>
+        <w:rPr>
+          <w:lang w:val="sv-SE"/>
+        </w:rPr>
+      </w:r>
+      <w:r>
+        <w:rPr>
+          <w:lang w:val="sv-SE"/>
+        </w:rPr>
+      </w:r>
+    </w:p>
+    <w:p>
+      <w:pPr>
+        <w:pStyle w:val="668"/>
+        <w:numPr>
+          <w:ilvl w:val="0"/>
+          <w:numId w:val="9"/>
+        </w:numPr>
+        <w:pBdr/>
+        <w:spacing/>
+        <w:ind/>
+        <w:rPr>
+          <w:lang w:val="sv-SE"/>
+        </w:rPr>
+      </w:pPr>
+      <w:r>
+        <w:rPr>
+          <w:highlight w:val="none"/>
+          <w:lang w:val="sv-SE" w:bidi="sv-SE"/>
+        </w:rPr>
+        <w:t xml:space="preserve">Tig! Lyd nu! </w:t>
+      </w:r>
+      <w:r>
+        <w:rPr>
+          <w:lang w:val="sv-SE"/>
+        </w:rPr>
+      </w:r>
+      <w:r>
+        <w:rPr>
+          <w:lang w:val="sv-SE"/>
+        </w:rPr>
+      </w:r>
+    </w:p>
+    <w:p>
+      <w:pPr>
+        <w:pBdr/>
+        <w:spacing/>
+        <w:ind/>
+        <w:rPr>
+          <w:highlight w:val="none"/>
+          <w:lang w:val="sv-SE" w:bidi="sv-SE"/>
+        </w:rPr>
+      </w:pPr>
+      <w:r>
+        <w:rPr>
+          <w:highlight w:val="none"/>
+          <w:lang w:val="sv-SE" w:bidi="sv-SE"/>
+        </w:rPr>
+        <w:t xml:space="preserve">Pjotr stegade fram och tog prinsessan ur Ramas famn</w:t>
+      </w:r>
+      <w:r>
+        <w:rPr>
+          <w:highlight w:val="none"/>
+          <w:lang w:val="sv-SE" w:bidi="sv-SE"/>
+        </w:rPr>
+        <w:t xml:space="preserve">. Han skulle precis kasta upp henne på Argos när han skymtade något i ögonvrån. På slätten, inte ens en halvtimmes ritt bort, såg han Hallas män. Deras gröna uniformer fick deras täta formation att se ut som en orm som slingrar sig fram, varje enskild ryttare ett fjäll. Han tog ett steg mot Rygar men hejdade sig. </w:t>
+      </w:r>
+      <w:r>
+        <w:rPr>
+          <w:highlight w:val="none"/>
+          <w:lang w:val="sv-SE" w:bidi="sv-SE"/>
+        </w:rPr>
+        <w:t xml:space="preserve">Han sänkte blicken. </w:t>
+      </w:r>
+      <w:r>
+        <w:rPr>
+          <w:highlight w:val="none"/>
+          <w:lang w:val="sv-SE" w:bidi="sv-SE"/>
+        </w:rPr>
+      </w:r>
+    </w:p>
+    <w:p>
+      <w:pPr>
+        <w:pStyle w:val="668"/>
+        <w:numPr>
+          <w:ilvl w:val="0"/>
+          <w:numId w:val="11"/>
+        </w:numPr>
+        <w:pBdr/>
+        <w:spacing/>
+        <w:ind/>
+        <w:rPr>
+          <w:highlight w:val="none"/>
+          <w:lang w:val="sv-SE" w:bidi="sv-SE"/>
+        </w:rPr>
+      </w:pPr>
+      <w:r>
+        <w:rPr>
+          <w:highlight w:val="none"/>
+          <w:lang w:val="sv-SE" w:bidi="sv-SE"/>
+        </w:rPr>
+        <w:t xml:space="preserve">Rama. Jag kräver mycket av dig. Jag beordrar dig att göra saker som jag vet att du inte klarar av. Jag gör det för att av den som givits mycket kommer mycket att avkrävas. Du har givits mycket. Du är en fattig gaturåtta och jag petar mina tänder med saker som är grövre än du. Men du har givits en skicklighet med svärdet som inte kommer gå obemärkt förbi. Men framförallt har du givits ett hjärta som vet att inte använda svärdet. Detta är det sista omöjliga uppdraget jag ger dig. Ta prinsessan till palatset. </w:t>
+      </w:r>
+      <w:r>
+        <w:rPr>
+          <w:highlight w:val="none"/>
+          <w:lang w:val="sv-SE" w:bidi="sv-SE"/>
+        </w:rPr>
+        <w:t xml:space="preserve">Och vad du än gör så låter du henne inte lämna hästens rygg. Om hon än vaknar och hotar med prygel eller lockar med kvinnlig värme så låter du henne inte stiga ned. Hon stiger ned när hennes far, kungen, kan ta emot henne</w:t>
+      </w:r>
+      <w:r>
+        <w:rPr>
+          <w:highlight w:val="none"/>
+          <w:lang w:val="sv-SE" w:bidi="sv-SE"/>
+        </w:rPr>
+        <w:t xml:space="preserve">. Bind fast henne om du måste. </w:t>
+      </w:r>
+      <w:r>
+        <w:rPr>
+          <w:highlight w:val="none"/>
+          <w:lang w:val="sv-SE" w:bidi="sv-SE"/>
+        </w:rPr>
+      </w:r>
+    </w:p>
+    <w:p>
+      <w:pPr>
+        <w:pBdr/>
+        <w:spacing/>
+        <w:ind w:firstLine="0" w:left="0"/>
+        <w:rPr>
+          <w:highlight w:val="none"/>
+          <w:lang w:val="sv-SE" w:bidi="sv-SE"/>
+        </w:rPr>
+      </w:pPr>
+      <w:r>
+        <w:rPr>
+          <w:highlight w:val="none"/>
+          <w:lang w:val="sv-SE" w:bidi="sv-SE"/>
+        </w:rPr>
+        <w:t xml:space="preserve">Pjotr stegade bort mot Argos och lyfte den medvetslösa prinsessan upp på hästens rygg. </w:t>
+      </w:r>
+      <w:r>
+        <w:rPr>
+          <w:highlight w:val="none"/>
+          <w:lang w:val="sv-SE" w:bidi="sv-SE"/>
+        </w:rPr>
+      </w:r>
+    </w:p>
+    <w:p>
+      <w:pPr>
+        <w:pStyle w:val="668"/>
+        <w:numPr>
+          <w:ilvl w:val="0"/>
+          <w:numId w:val="13"/>
+        </w:numPr>
+        <w:pBdr/>
+        <w:spacing/>
+        <w:ind/>
+        <w:rPr>
+          <w:highlight w:val="none"/>
+          <w:lang w:val="sv-SE" w:bidi="sv-SE"/>
+        </w:rPr>
+      </w:pPr>
+      <w:r>
+        <w:rPr>
+          <w:highlight w:val="none"/>
+          <w:lang w:val="sv-SE" w:bidi="sv-SE"/>
+        </w:rPr>
+        <w:t xml:space="preserve">Gå nu. Min uppgift ringlar mot oss på slätten där borta. </w:t>
+      </w:r>
+      <w:r>
+        <w:rPr>
+          <w:highlight w:val="none"/>
+          <w:lang w:val="sv-SE" w:bidi="sv-SE"/>
+        </w:rPr>
+      </w:r>
+    </w:p>
+    <w:p>
+      <w:pPr>
+        <w:pBdr/>
+        <w:spacing/>
+        <w:ind w:firstLine="0" w:left="0"/>
+        <w:rPr>
+          <w:highlight w:val="none"/>
+          <w:lang w:val="sv-SE" w:bidi="sv-SE"/>
+        </w:rPr>
+      </w:pPr>
+      <w:r>
+        <w:rPr>
+          <w:highlight w:val="none"/>
+          <w:lang w:val="sv-SE" w:bidi="sv-SE"/>
+        </w:rPr>
+        <w:t xml:space="preserve">Rama spärrade upp ögonen när han såg de grönklädda ryttarna. Han förde Argos</w:t>
+      </w:r>
+      <w:r>
+        <w:rPr>
+          <w:highlight w:val="none"/>
+          <w:lang w:val="sv-SE" w:bidi="sv-SE"/>
+        </w:rPr>
+        <w:t xml:space="preserve"> mot  vadställets bortre strand och Pjotr tryckte sitt ansi</w:t>
+      </w:r>
+      <w:r>
+        <w:rPr>
+          <w:highlight w:val="none"/>
+          <w:lang w:val="sv-SE" w:bidi="sv-SE"/>
+        </w:rPr>
+        <w:t xml:space="preserve">kte mot Rygars. Argos var den kraftigare hästen men Rygar var hans. Pjotr viskade på språket bara Rygar förstod och lät axlarna falla. </w:t>
+      </w:r>
+      <w:r/>
+      <w:r>
+        <w:rPr>
+          <w:highlight w:val="none"/>
+          <w:lang w:val="sv-SE" w:bidi="sv-SE"/>
+        </w:rPr>
+      </w:r>
+      <w:r>
+        <w:rPr>
+          <w:highlight w:val="none"/>
+          <w:lang w:val="sv-SE" w:bidi="sv-SE"/>
+        </w:rPr>
+      </w:r>
+      <w:r>
+        <w:rPr>
+          <w:highlight w:val="none"/>
+          <w:lang w:val="sv-SE" w:bidi="sv-SE"/>
+        </w:rPr>
+      </w:r>
+      <w:r>
+        <w:rPr>
+          <w:highlight w:val="none"/>
+          <w:lang w:val="sv-SE" w:bidi="sv-SE"/>
+        </w:rPr>
+      </w:r>
+      <w:r>
+        <w:rPr>
+          <w:highlight w:val="none"/>
+          <w:lang w:val="sv-SE" w:bidi="sv-SE"/>
+        </w:rPr>
+        <w:t xml:space="preserve">Rama nådde den bortre stranden och vände blicken mot sin mästare. Pjotr lade sin knutna nä</w:t>
+      </w:r>
+      <w:r>
+        <w:rPr>
+          <w:highlight w:val="none"/>
+          <w:lang w:val="sv-SE" w:bidi="sv-SE"/>
+        </w:rPr>
+        <w:t xml:space="preserve">ve mot bröstet i den hälsning som användes mot jämbördiga. Rama höjde sin hand i hälsningen som används mot kunglighet. Pjotr ledde Rygar tillbaka och satt upp. Han slöt sina ögon och lät ögonlocken blicka upp mot himlen. Sedan drog han sitt svärd och red.</w:t>
+      </w:r>
+      <w:r/>
+      <w:r>
+        <w:rPr>
+          <w:highlight w:val="none"/>
+          <w:lang w:val="sv-SE" w:bidi="sv-SE"/>
+        </w:rPr>
+      </w:r>
+      <w:r>
+        <w:rPr>
+          <w:highlight w:val="none"/>
+          <w:lang w:val="sv-SE" w:bidi="sv-SE"/>
+        </w:rPr>
+      </w:r>
+      <w:r>
+        <w:rPr>
+          <w:highlight w:val="none"/>
+          <w:lang w:val="sv-SE" w:bidi="sv-SE"/>
+        </w:rPr>
+      </w:r>
+      <w:r>
+        <w:rPr>
+          <w:highlight w:val="none"/>
+          <w:lang w:val="sv-SE" w:bidi="sv-SE"/>
+        </w:rPr>
+      </w:r>
+    </w:p>
+    <w:p>
+      <w:pPr>
+        <w:pBdr/>
+        <w:spacing/>
+        <w:ind w:firstLine="0" w:left="0"/>
+        <w:rPr>
+          <w:highlight w:val="none"/>
+          <w:lang w:val="sv-SE" w:bidi="sv-SE"/>
+        </w:rPr>
+      </w:pPr>
+      <w:r>
+        <w:rPr>
+          <w:highlight w:val="none"/>
+          <w:lang w:val="sv-SE" w:bidi="sv-SE"/>
+        </w:rPr>
+      </w:r>
+      <w:r>
+        <w:rPr>
+          <w:color w:val="000000" w:themeColor="text1"/>
+          <w:lang w:val="sv-SE" w:bidi="sv-SE"/>
+        </w:rPr>
+        <w:t xml:space="preserve">&lt;/</w:t>
+      </w:r>
+      <w:r>
+        <w:rPr>
+          <w:color w:val="000000" w:themeColor="text1"/>
+          <w:lang w:val="sv-SE" w:bidi="sv-SE"/>
+        </w:rPr>
+        <w:t xml:space="preserve">SecondDraft</w:t>
+      </w:r>
+      <w:r>
+        <w:rPr>
+          <w:color w:val="000000" w:themeColor="text1"/>
+          <w:lang w:val="sv-SE" w:bidi="sv-SE"/>
+        </w:rPr>
+        <w:t xml:space="preserve">&gt;</w:t>
+      </w:r>
+      <w:r>
+        <w:rPr>
+          <w:highlight w:val="none"/>
+          <w:lang w:val="sv-SE" w:bidi="sv-SE"/>
+        </w:rPr>
+      </w:r>
+      <w:r/>
+    </w:p>
+    <w:p>
+      <w:pPr>
+        <w:pBdr/>
+        <w:spacing/>
+        <w:ind w:firstLine="0" w:left="0"/>
+        <w:rPr>
+          <w:lang w:val="sv-SE"/>
+        </w:rPr>
+      </w:pPr>
+      <w:r>
+        <w:rPr>
+          <w:highlight w:val="none"/>
+          <w:lang w:val="sv-SE" w:bidi="sv-SE"/>
+        </w:rPr>
+      </w:r>
+      <w:r>
+        <w:rPr>
+          <w:highlight w:val="none"/>
+          <w:lang w:val="sv-SE" w:bidi="sv-SE"/>
+        </w:rPr>
       </w:r>
       <w:r>
         <w:rPr>
@@ -1468,6 +2489,1182 @@
       <w:suff w:val="tab"/>
     </w:lvl>
   </w:abstractNum>
+  <w:abstractNum w:abstractNumId="5">
+    <w:nsid w:val="6445E71F"/>
+    <w:lvl w:ilvl="0">
+      <w:isLgl w:val="false"/>
+      <w:lvlJc w:val="left"/>
+      <w:lvlText w:val="–"/>
+      <w:numFmt w:val="bullet"/>
+      <w:pPr>
+        <w:pBdr/>
+        <w:spacing/>
+        <w:ind w:hanging="360" w:left="709"/>
+      </w:pPr>
+      <w:rPr>
+        <w:rFonts w:hint="default" w:ascii="Arial" w:hAnsi="Arial" w:eastAsia="Arial" w:cs="Arial"/>
+      </w:rPr>
+      <w:start w:val="1"/>
+      <w:suff w:val="tab"/>
+    </w:lvl>
+    <w:lvl w:ilvl="1">
+      <w:isLgl w:val="false"/>
+      <w:lvlJc w:val="left"/>
+      <w:lvlText w:val="o"/>
+      <w:numFmt w:val="bullet"/>
+      <w:pPr>
+        <w:pBdr/>
+        <w:spacing/>
+        <w:ind w:hanging="360" w:left="1429"/>
+      </w:pPr>
+      <w:rPr>
+        <w:rFonts w:hint="default" w:ascii="Courier New" w:hAnsi="Courier New" w:eastAsia="Courier New" w:cs="Courier New"/>
+      </w:rPr>
+      <w:start w:val="1"/>
+      <w:suff w:val="tab"/>
+    </w:lvl>
+    <w:lvl w:ilvl="2">
+      <w:isLgl w:val="false"/>
+      <w:lvlJc w:val="left"/>
+      <w:lvlText w:val="§"/>
+      <w:numFmt w:val="bullet"/>
+      <w:pPr>
+        <w:pBdr/>
+        <w:spacing/>
+        <w:ind w:hanging="360" w:left="2149"/>
+      </w:pPr>
+      <w:rPr>
+        <w:rFonts w:hint="default" w:ascii="Wingdings" w:hAnsi="Wingdings" w:eastAsia="Wingdings" w:cs="Wingdings"/>
+      </w:rPr>
+      <w:start w:val="1"/>
+      <w:suff w:val="tab"/>
+    </w:lvl>
+    <w:lvl w:ilvl="3">
+      <w:isLgl w:val="false"/>
+      <w:lvlJc w:val="left"/>
+      <w:lvlText w:val="·"/>
+      <w:numFmt w:val="bullet"/>
+      <w:pPr>
+        <w:pBdr/>
+        <w:spacing/>
+        <w:ind w:hanging="360" w:left="2869"/>
+      </w:pPr>
+      <w:rPr>
+        <w:rFonts w:hint="default" w:ascii="Symbol" w:hAnsi="Symbol" w:eastAsia="Symbol" w:cs="Symbol"/>
+      </w:rPr>
+      <w:start w:val="1"/>
+      <w:suff w:val="tab"/>
+    </w:lvl>
+    <w:lvl w:ilvl="4">
+      <w:isLgl w:val="false"/>
+      <w:lvlJc w:val="left"/>
+      <w:lvlText w:val="o"/>
+      <w:numFmt w:val="bullet"/>
+      <w:pPr>
+        <w:pBdr/>
+        <w:spacing/>
+        <w:ind w:hanging="360" w:left="3589"/>
+      </w:pPr>
+      <w:rPr>
+        <w:rFonts w:hint="default" w:ascii="Courier New" w:hAnsi="Courier New" w:eastAsia="Courier New" w:cs="Courier New"/>
+      </w:rPr>
+      <w:start w:val="1"/>
+      <w:suff w:val="tab"/>
+    </w:lvl>
+    <w:lvl w:ilvl="5">
+      <w:isLgl w:val="false"/>
+      <w:lvlJc w:val="left"/>
+      <w:lvlText w:val="§"/>
+      <w:numFmt w:val="bullet"/>
+      <w:pPr>
+        <w:pBdr/>
+        <w:spacing/>
+        <w:ind w:hanging="360" w:left="4309"/>
+      </w:pPr>
+      <w:rPr>
+        <w:rFonts w:hint="default" w:ascii="Wingdings" w:hAnsi="Wingdings" w:eastAsia="Wingdings" w:cs="Wingdings"/>
+      </w:rPr>
+      <w:start w:val="1"/>
+      <w:suff w:val="tab"/>
+    </w:lvl>
+    <w:lvl w:ilvl="6">
+      <w:isLgl w:val="false"/>
+      <w:lvlJc w:val="left"/>
+      <w:lvlText w:val="·"/>
+      <w:numFmt w:val="bullet"/>
+      <w:pPr>
+        <w:pBdr/>
+        <w:spacing/>
+        <w:ind w:hanging="360" w:left="5029"/>
+      </w:pPr>
+      <w:rPr>
+        <w:rFonts w:hint="default" w:ascii="Symbol" w:hAnsi="Symbol" w:eastAsia="Symbol" w:cs="Symbol"/>
+      </w:rPr>
+      <w:start w:val="1"/>
+      <w:suff w:val="tab"/>
+    </w:lvl>
+    <w:lvl w:ilvl="7">
+      <w:isLgl w:val="false"/>
+      <w:lvlJc w:val="left"/>
+      <w:lvlText w:val="o"/>
+      <w:numFmt w:val="bullet"/>
+      <w:pPr>
+        <w:pBdr/>
+        <w:spacing/>
+        <w:ind w:hanging="360" w:left="5749"/>
+      </w:pPr>
+      <w:rPr>
+        <w:rFonts w:hint="default" w:ascii="Courier New" w:hAnsi="Courier New" w:eastAsia="Courier New" w:cs="Courier New"/>
+      </w:rPr>
+      <w:start w:val="1"/>
+      <w:suff w:val="tab"/>
+    </w:lvl>
+    <w:lvl w:ilvl="8">
+      <w:isLgl w:val="false"/>
+      <w:lvlJc w:val="left"/>
+      <w:lvlText w:val="§"/>
+      <w:numFmt w:val="bullet"/>
+      <w:pPr>
+        <w:pBdr/>
+        <w:spacing/>
+        <w:ind w:hanging="360" w:left="6469"/>
+      </w:pPr>
+      <w:rPr>
+        <w:rFonts w:hint="default" w:ascii="Wingdings" w:hAnsi="Wingdings" w:eastAsia="Wingdings" w:cs="Wingdings"/>
+      </w:rPr>
+      <w:start w:val="1"/>
+      <w:suff w:val="tab"/>
+    </w:lvl>
+  </w:abstractNum>
+  <w:abstractNum w:abstractNumId="6">
+    <w:nsid w:val="7EB5249F"/>
+    <w:lvl w:ilvl="0">
+      <w:isLgl w:val="false"/>
+      <w:lvlJc w:val="left"/>
+      <w:lvlText w:val="–"/>
+      <w:numFmt w:val="bullet"/>
+      <w:pPr>
+        <w:pBdr/>
+        <w:spacing/>
+        <w:ind w:hanging="360" w:left="709"/>
+      </w:pPr>
+      <w:rPr>
+        <w:rFonts w:hint="default" w:ascii="Arial" w:hAnsi="Arial" w:eastAsia="Arial" w:cs="Arial"/>
+      </w:rPr>
+      <w:start w:val="1"/>
+      <w:suff w:val="tab"/>
+    </w:lvl>
+    <w:lvl w:ilvl="1">
+      <w:isLgl w:val="false"/>
+      <w:lvlJc w:val="left"/>
+      <w:lvlText w:val="o"/>
+      <w:numFmt w:val="bullet"/>
+      <w:pPr>
+        <w:pBdr/>
+        <w:spacing/>
+        <w:ind w:hanging="360" w:left="1429"/>
+      </w:pPr>
+      <w:rPr>
+        <w:rFonts w:hint="default" w:ascii="Courier New" w:hAnsi="Courier New" w:eastAsia="Courier New" w:cs="Courier New"/>
+      </w:rPr>
+      <w:start w:val="1"/>
+      <w:suff w:val="tab"/>
+    </w:lvl>
+    <w:lvl w:ilvl="2">
+      <w:isLgl w:val="false"/>
+      <w:lvlJc w:val="left"/>
+      <w:lvlText w:val="§"/>
+      <w:numFmt w:val="bullet"/>
+      <w:pPr>
+        <w:pBdr/>
+        <w:spacing/>
+        <w:ind w:hanging="360" w:left="2149"/>
+      </w:pPr>
+      <w:rPr>
+        <w:rFonts w:hint="default" w:ascii="Wingdings" w:hAnsi="Wingdings" w:eastAsia="Wingdings" w:cs="Wingdings"/>
+      </w:rPr>
+      <w:start w:val="1"/>
+      <w:suff w:val="tab"/>
+    </w:lvl>
+    <w:lvl w:ilvl="3">
+      <w:isLgl w:val="false"/>
+      <w:lvlJc w:val="left"/>
+      <w:lvlText w:val="·"/>
+      <w:numFmt w:val="bullet"/>
+      <w:pPr>
+        <w:pBdr/>
+        <w:spacing/>
+        <w:ind w:hanging="360" w:left="2869"/>
+      </w:pPr>
+      <w:rPr>
+        <w:rFonts w:hint="default" w:ascii="Symbol" w:hAnsi="Symbol" w:eastAsia="Symbol" w:cs="Symbol"/>
+      </w:rPr>
+      <w:start w:val="1"/>
+      <w:suff w:val="tab"/>
+    </w:lvl>
+    <w:lvl w:ilvl="4">
+      <w:isLgl w:val="false"/>
+      <w:lvlJc w:val="left"/>
+      <w:lvlText w:val="o"/>
+      <w:numFmt w:val="bullet"/>
+      <w:pPr>
+        <w:pBdr/>
+        <w:spacing/>
+        <w:ind w:hanging="360" w:left="3589"/>
+      </w:pPr>
+      <w:rPr>
+        <w:rFonts w:hint="default" w:ascii="Courier New" w:hAnsi="Courier New" w:eastAsia="Courier New" w:cs="Courier New"/>
+      </w:rPr>
+      <w:start w:val="1"/>
+      <w:suff w:val="tab"/>
+    </w:lvl>
+    <w:lvl w:ilvl="5">
+      <w:isLgl w:val="false"/>
+      <w:lvlJc w:val="left"/>
+      <w:lvlText w:val="§"/>
+      <w:numFmt w:val="bullet"/>
+      <w:pPr>
+        <w:pBdr/>
+        <w:spacing/>
+        <w:ind w:hanging="360" w:left="4309"/>
+      </w:pPr>
+      <w:rPr>
+        <w:rFonts w:hint="default" w:ascii="Wingdings" w:hAnsi="Wingdings" w:eastAsia="Wingdings" w:cs="Wingdings"/>
+      </w:rPr>
+      <w:start w:val="1"/>
+      <w:suff w:val="tab"/>
+    </w:lvl>
+    <w:lvl w:ilvl="6">
+      <w:isLgl w:val="false"/>
+      <w:lvlJc w:val="left"/>
+      <w:lvlText w:val="·"/>
+      <w:numFmt w:val="bullet"/>
+      <w:pPr>
+        <w:pBdr/>
+        <w:spacing/>
+        <w:ind w:hanging="360" w:left="5029"/>
+      </w:pPr>
+      <w:rPr>
+        <w:rFonts w:hint="default" w:ascii="Symbol" w:hAnsi="Symbol" w:eastAsia="Symbol" w:cs="Symbol"/>
+      </w:rPr>
+      <w:start w:val="1"/>
+      <w:suff w:val="tab"/>
+    </w:lvl>
+    <w:lvl w:ilvl="7">
+      <w:isLgl w:val="false"/>
+      <w:lvlJc w:val="left"/>
+      <w:lvlText w:val="o"/>
+      <w:numFmt w:val="bullet"/>
+      <w:pPr>
+        <w:pBdr/>
+        <w:spacing/>
+        <w:ind w:hanging="360" w:left="5749"/>
+      </w:pPr>
+      <w:rPr>
+        <w:rFonts w:hint="default" w:ascii="Courier New" w:hAnsi="Courier New" w:eastAsia="Courier New" w:cs="Courier New"/>
+      </w:rPr>
+      <w:start w:val="1"/>
+      <w:suff w:val="tab"/>
+    </w:lvl>
+    <w:lvl w:ilvl="8">
+      <w:isLgl w:val="false"/>
+      <w:lvlJc w:val="left"/>
+      <w:lvlText w:val="§"/>
+      <w:numFmt w:val="bullet"/>
+      <w:pPr>
+        <w:pBdr/>
+        <w:spacing/>
+        <w:ind w:hanging="360" w:left="6469"/>
+      </w:pPr>
+      <w:rPr>
+        <w:rFonts w:hint="default" w:ascii="Wingdings" w:hAnsi="Wingdings" w:eastAsia="Wingdings" w:cs="Wingdings"/>
+      </w:rPr>
+      <w:start w:val="1"/>
+      <w:suff w:val="tab"/>
+    </w:lvl>
+  </w:abstractNum>
+  <w:abstractNum w:abstractNumId="7">
+    <w:nsid w:val="63050973"/>
+    <w:lvl w:ilvl="0">
+      <w:isLgl w:val="false"/>
+      <w:lvlJc w:val="left"/>
+      <w:lvlText w:val="–"/>
+      <w:numFmt w:val="bullet"/>
+      <w:pPr>
+        <w:pBdr/>
+        <w:spacing/>
+        <w:ind w:hanging="360" w:left="709"/>
+      </w:pPr>
+      <w:rPr>
+        <w:rFonts w:hint="default" w:ascii="Arial" w:hAnsi="Arial" w:eastAsia="Arial" w:cs="Arial"/>
+      </w:rPr>
+      <w:start w:val="1"/>
+      <w:suff w:val="tab"/>
+    </w:lvl>
+    <w:lvl w:ilvl="1">
+      <w:isLgl w:val="false"/>
+      <w:lvlJc w:val="left"/>
+      <w:lvlText w:val="o"/>
+      <w:numFmt w:val="bullet"/>
+      <w:pPr>
+        <w:pBdr/>
+        <w:spacing/>
+        <w:ind w:hanging="360" w:left="1429"/>
+      </w:pPr>
+      <w:rPr>
+        <w:rFonts w:hint="default" w:ascii="Courier New" w:hAnsi="Courier New" w:eastAsia="Courier New" w:cs="Courier New"/>
+      </w:rPr>
+      <w:start w:val="1"/>
+      <w:suff w:val="tab"/>
+    </w:lvl>
+    <w:lvl w:ilvl="2">
+      <w:isLgl w:val="false"/>
+      <w:lvlJc w:val="left"/>
+      <w:lvlText w:val="§"/>
+      <w:numFmt w:val="bullet"/>
+      <w:pPr>
+        <w:pBdr/>
+        <w:spacing/>
+        <w:ind w:hanging="360" w:left="2149"/>
+      </w:pPr>
+      <w:rPr>
+        <w:rFonts w:hint="default" w:ascii="Wingdings" w:hAnsi="Wingdings" w:eastAsia="Wingdings" w:cs="Wingdings"/>
+      </w:rPr>
+      <w:start w:val="1"/>
+      <w:suff w:val="tab"/>
+    </w:lvl>
+    <w:lvl w:ilvl="3">
+      <w:isLgl w:val="false"/>
+      <w:lvlJc w:val="left"/>
+      <w:lvlText w:val="·"/>
+      <w:numFmt w:val="bullet"/>
+      <w:pPr>
+        <w:pBdr/>
+        <w:spacing/>
+        <w:ind w:hanging="360" w:left="2869"/>
+      </w:pPr>
+      <w:rPr>
+        <w:rFonts w:hint="default" w:ascii="Symbol" w:hAnsi="Symbol" w:eastAsia="Symbol" w:cs="Symbol"/>
+      </w:rPr>
+      <w:start w:val="1"/>
+      <w:suff w:val="tab"/>
+    </w:lvl>
+    <w:lvl w:ilvl="4">
+      <w:isLgl w:val="false"/>
+      <w:lvlJc w:val="left"/>
+      <w:lvlText w:val="o"/>
+      <w:numFmt w:val="bullet"/>
+      <w:pPr>
+        <w:pBdr/>
+        <w:spacing/>
+        <w:ind w:hanging="360" w:left="3589"/>
+      </w:pPr>
+      <w:rPr>
+        <w:rFonts w:hint="default" w:ascii="Courier New" w:hAnsi="Courier New" w:eastAsia="Courier New" w:cs="Courier New"/>
+      </w:rPr>
+      <w:start w:val="1"/>
+      <w:suff w:val="tab"/>
+    </w:lvl>
+    <w:lvl w:ilvl="5">
+      <w:isLgl w:val="false"/>
+      <w:lvlJc w:val="left"/>
+      <w:lvlText w:val="§"/>
+      <w:numFmt w:val="bullet"/>
+      <w:pPr>
+        <w:pBdr/>
+        <w:spacing/>
+        <w:ind w:hanging="360" w:left="4309"/>
+      </w:pPr>
+      <w:rPr>
+        <w:rFonts w:hint="default" w:ascii="Wingdings" w:hAnsi="Wingdings" w:eastAsia="Wingdings" w:cs="Wingdings"/>
+      </w:rPr>
+      <w:start w:val="1"/>
+      <w:suff w:val="tab"/>
+    </w:lvl>
+    <w:lvl w:ilvl="6">
+      <w:isLgl w:val="false"/>
+      <w:lvlJc w:val="left"/>
+      <w:lvlText w:val="·"/>
+      <w:numFmt w:val="bullet"/>
+      <w:pPr>
+        <w:pBdr/>
+        <w:spacing/>
+        <w:ind w:hanging="360" w:left="5029"/>
+      </w:pPr>
+      <w:rPr>
+        <w:rFonts w:hint="default" w:ascii="Symbol" w:hAnsi="Symbol" w:eastAsia="Symbol" w:cs="Symbol"/>
+      </w:rPr>
+      <w:start w:val="1"/>
+      <w:suff w:val="tab"/>
+    </w:lvl>
+    <w:lvl w:ilvl="7">
+      <w:isLgl w:val="false"/>
+      <w:lvlJc w:val="left"/>
+      <w:lvlText w:val="o"/>
+      <w:numFmt w:val="bullet"/>
+      <w:pPr>
+        <w:pBdr/>
+        <w:spacing/>
+        <w:ind w:hanging="360" w:left="5749"/>
+      </w:pPr>
+      <w:rPr>
+        <w:rFonts w:hint="default" w:ascii="Courier New" w:hAnsi="Courier New" w:eastAsia="Courier New" w:cs="Courier New"/>
+      </w:rPr>
+      <w:start w:val="1"/>
+      <w:suff w:val="tab"/>
+    </w:lvl>
+    <w:lvl w:ilvl="8">
+      <w:isLgl w:val="false"/>
+      <w:lvlJc w:val="left"/>
+      <w:lvlText w:val="§"/>
+      <w:numFmt w:val="bullet"/>
+      <w:pPr>
+        <w:pBdr/>
+        <w:spacing/>
+        <w:ind w:hanging="360" w:left="6469"/>
+      </w:pPr>
+      <w:rPr>
+        <w:rFonts w:hint="default" w:ascii="Wingdings" w:hAnsi="Wingdings" w:eastAsia="Wingdings" w:cs="Wingdings"/>
+      </w:rPr>
+      <w:start w:val="1"/>
+      <w:suff w:val="tab"/>
+    </w:lvl>
+  </w:abstractNum>
+  <w:abstractNum w:abstractNumId="8">
+    <w:nsid w:val="617B74F6"/>
+    <w:lvl w:ilvl="0">
+      <w:isLgl w:val="false"/>
+      <w:lvlJc w:val="left"/>
+      <w:lvlText w:val="–"/>
+      <w:numFmt w:val="bullet"/>
+      <w:pPr>
+        <w:pBdr/>
+        <w:spacing/>
+        <w:ind w:hanging="360" w:left="709"/>
+      </w:pPr>
+      <w:rPr>
+        <w:rFonts w:hint="default" w:ascii="Arial" w:hAnsi="Arial" w:eastAsia="Arial" w:cs="Arial"/>
+      </w:rPr>
+      <w:start w:val="1"/>
+      <w:suff w:val="tab"/>
+    </w:lvl>
+    <w:lvl w:ilvl="1">
+      <w:isLgl w:val="false"/>
+      <w:lvlJc w:val="left"/>
+      <w:lvlText w:val="o"/>
+      <w:numFmt w:val="bullet"/>
+      <w:pPr>
+        <w:pBdr/>
+        <w:spacing/>
+        <w:ind w:hanging="360" w:left="1429"/>
+      </w:pPr>
+      <w:rPr>
+        <w:rFonts w:hint="default" w:ascii="Courier New" w:hAnsi="Courier New" w:eastAsia="Courier New" w:cs="Courier New"/>
+      </w:rPr>
+      <w:start w:val="1"/>
+      <w:suff w:val="tab"/>
+    </w:lvl>
+    <w:lvl w:ilvl="2">
+      <w:isLgl w:val="false"/>
+      <w:lvlJc w:val="left"/>
+      <w:lvlText w:val="§"/>
+      <w:numFmt w:val="bullet"/>
+      <w:pPr>
+        <w:pBdr/>
+        <w:spacing/>
+        <w:ind w:hanging="360" w:left="2149"/>
+      </w:pPr>
+      <w:rPr>
+        <w:rFonts w:hint="default" w:ascii="Wingdings" w:hAnsi="Wingdings" w:eastAsia="Wingdings" w:cs="Wingdings"/>
+      </w:rPr>
+      <w:start w:val="1"/>
+      <w:suff w:val="tab"/>
+    </w:lvl>
+    <w:lvl w:ilvl="3">
+      <w:isLgl w:val="false"/>
+      <w:lvlJc w:val="left"/>
+      <w:lvlText w:val="·"/>
+      <w:numFmt w:val="bullet"/>
+      <w:pPr>
+        <w:pBdr/>
+        <w:spacing/>
+        <w:ind w:hanging="360" w:left="2869"/>
+      </w:pPr>
+      <w:rPr>
+        <w:rFonts w:hint="default" w:ascii="Symbol" w:hAnsi="Symbol" w:eastAsia="Symbol" w:cs="Symbol"/>
+      </w:rPr>
+      <w:start w:val="1"/>
+      <w:suff w:val="tab"/>
+    </w:lvl>
+    <w:lvl w:ilvl="4">
+      <w:isLgl w:val="false"/>
+      <w:lvlJc w:val="left"/>
+      <w:lvlText w:val="o"/>
+      <w:numFmt w:val="bullet"/>
+      <w:pPr>
+        <w:pBdr/>
+        <w:spacing/>
+        <w:ind w:hanging="360" w:left="3589"/>
+      </w:pPr>
+      <w:rPr>
+        <w:rFonts w:hint="default" w:ascii="Courier New" w:hAnsi="Courier New" w:eastAsia="Courier New" w:cs="Courier New"/>
+      </w:rPr>
+      <w:start w:val="1"/>
+      <w:suff w:val="tab"/>
+    </w:lvl>
+    <w:lvl w:ilvl="5">
+      <w:isLgl w:val="false"/>
+      <w:lvlJc w:val="left"/>
+      <w:lvlText w:val="§"/>
+      <w:numFmt w:val="bullet"/>
+      <w:pPr>
+        <w:pBdr/>
+        <w:spacing/>
+        <w:ind w:hanging="360" w:left="4309"/>
+      </w:pPr>
+      <w:rPr>
+        <w:rFonts w:hint="default" w:ascii="Wingdings" w:hAnsi="Wingdings" w:eastAsia="Wingdings" w:cs="Wingdings"/>
+      </w:rPr>
+      <w:start w:val="1"/>
+      <w:suff w:val="tab"/>
+    </w:lvl>
+    <w:lvl w:ilvl="6">
+      <w:isLgl w:val="false"/>
+      <w:lvlJc w:val="left"/>
+      <w:lvlText w:val="·"/>
+      <w:numFmt w:val="bullet"/>
+      <w:pPr>
+        <w:pBdr/>
+        <w:spacing/>
+        <w:ind w:hanging="360" w:left="5029"/>
+      </w:pPr>
+      <w:rPr>
+        <w:rFonts w:hint="default" w:ascii="Symbol" w:hAnsi="Symbol" w:eastAsia="Symbol" w:cs="Symbol"/>
+      </w:rPr>
+      <w:start w:val="1"/>
+      <w:suff w:val="tab"/>
+    </w:lvl>
+    <w:lvl w:ilvl="7">
+      <w:isLgl w:val="false"/>
+      <w:lvlJc w:val="left"/>
+      <w:lvlText w:val="o"/>
+      <w:numFmt w:val="bullet"/>
+      <w:pPr>
+        <w:pBdr/>
+        <w:spacing/>
+        <w:ind w:hanging="360" w:left="5749"/>
+      </w:pPr>
+      <w:rPr>
+        <w:rFonts w:hint="default" w:ascii="Courier New" w:hAnsi="Courier New" w:eastAsia="Courier New" w:cs="Courier New"/>
+      </w:rPr>
+      <w:start w:val="1"/>
+      <w:suff w:val="tab"/>
+    </w:lvl>
+    <w:lvl w:ilvl="8">
+      <w:isLgl w:val="false"/>
+      <w:lvlJc w:val="left"/>
+      <w:lvlText w:val="§"/>
+      <w:numFmt w:val="bullet"/>
+      <w:pPr>
+        <w:pBdr/>
+        <w:spacing/>
+        <w:ind w:hanging="360" w:left="6469"/>
+      </w:pPr>
+      <w:rPr>
+        <w:rFonts w:hint="default" w:ascii="Wingdings" w:hAnsi="Wingdings" w:eastAsia="Wingdings" w:cs="Wingdings"/>
+      </w:rPr>
+      <w:start w:val="1"/>
+      <w:suff w:val="tab"/>
+    </w:lvl>
+  </w:abstractNum>
+  <w:abstractNum w:abstractNumId="9">
+    <w:nsid w:val="72E9ABC1"/>
+    <w:lvl w:ilvl="0">
+      <w:isLgl w:val="false"/>
+      <w:lvlJc w:val="left"/>
+      <w:lvlText w:val="–"/>
+      <w:numFmt w:val="bullet"/>
+      <w:pPr>
+        <w:pBdr/>
+        <w:spacing/>
+        <w:ind w:hanging="360" w:left="709"/>
+      </w:pPr>
+      <w:rPr>
+        <w:rFonts w:hint="default" w:ascii="Arial" w:hAnsi="Arial" w:eastAsia="Arial" w:cs="Arial"/>
+      </w:rPr>
+      <w:start w:val="1"/>
+      <w:suff w:val="tab"/>
+    </w:lvl>
+    <w:lvl w:ilvl="1">
+      <w:isLgl w:val="false"/>
+      <w:lvlJc w:val="left"/>
+      <w:lvlText w:val="o"/>
+      <w:numFmt w:val="bullet"/>
+      <w:pPr>
+        <w:pBdr/>
+        <w:spacing/>
+        <w:ind w:hanging="360" w:left="1429"/>
+      </w:pPr>
+      <w:rPr>
+        <w:rFonts w:hint="default" w:ascii="Courier New" w:hAnsi="Courier New" w:eastAsia="Courier New" w:cs="Courier New"/>
+      </w:rPr>
+      <w:start w:val="1"/>
+      <w:suff w:val="tab"/>
+    </w:lvl>
+    <w:lvl w:ilvl="2">
+      <w:isLgl w:val="false"/>
+      <w:lvlJc w:val="left"/>
+      <w:lvlText w:val="§"/>
+      <w:numFmt w:val="bullet"/>
+      <w:pPr>
+        <w:pBdr/>
+        <w:spacing/>
+        <w:ind w:hanging="360" w:left="2149"/>
+      </w:pPr>
+      <w:rPr>
+        <w:rFonts w:hint="default" w:ascii="Wingdings" w:hAnsi="Wingdings" w:eastAsia="Wingdings" w:cs="Wingdings"/>
+      </w:rPr>
+      <w:start w:val="1"/>
+      <w:suff w:val="tab"/>
+    </w:lvl>
+    <w:lvl w:ilvl="3">
+      <w:isLgl w:val="false"/>
+      <w:lvlJc w:val="left"/>
+      <w:lvlText w:val="·"/>
+      <w:numFmt w:val="bullet"/>
+      <w:pPr>
+        <w:pBdr/>
+        <w:spacing/>
+        <w:ind w:hanging="360" w:left="2869"/>
+      </w:pPr>
+      <w:rPr>
+        <w:rFonts w:hint="default" w:ascii="Symbol" w:hAnsi="Symbol" w:eastAsia="Symbol" w:cs="Symbol"/>
+      </w:rPr>
+      <w:start w:val="1"/>
+      <w:suff w:val="tab"/>
+    </w:lvl>
+    <w:lvl w:ilvl="4">
+      <w:isLgl w:val="false"/>
+      <w:lvlJc w:val="left"/>
+      <w:lvlText w:val="o"/>
+      <w:numFmt w:val="bullet"/>
+      <w:pPr>
+        <w:pBdr/>
+        <w:spacing/>
+        <w:ind w:hanging="360" w:left="3589"/>
+      </w:pPr>
+      <w:rPr>
+        <w:rFonts w:hint="default" w:ascii="Courier New" w:hAnsi="Courier New" w:eastAsia="Courier New" w:cs="Courier New"/>
+      </w:rPr>
+      <w:start w:val="1"/>
+      <w:suff w:val="tab"/>
+    </w:lvl>
+    <w:lvl w:ilvl="5">
+      <w:isLgl w:val="false"/>
+      <w:lvlJc w:val="left"/>
+      <w:lvlText w:val="§"/>
+      <w:numFmt w:val="bullet"/>
+      <w:pPr>
+        <w:pBdr/>
+        <w:spacing/>
+        <w:ind w:hanging="360" w:left="4309"/>
+      </w:pPr>
+      <w:rPr>
+        <w:rFonts w:hint="default" w:ascii="Wingdings" w:hAnsi="Wingdings" w:eastAsia="Wingdings" w:cs="Wingdings"/>
+      </w:rPr>
+      <w:start w:val="1"/>
+      <w:suff w:val="tab"/>
+    </w:lvl>
+    <w:lvl w:ilvl="6">
+      <w:isLgl w:val="false"/>
+      <w:lvlJc w:val="left"/>
+      <w:lvlText w:val="·"/>
+      <w:numFmt w:val="bullet"/>
+      <w:pPr>
+        <w:pBdr/>
+        <w:spacing/>
+        <w:ind w:hanging="360" w:left="5029"/>
+      </w:pPr>
+      <w:rPr>
+        <w:rFonts w:hint="default" w:ascii="Symbol" w:hAnsi="Symbol" w:eastAsia="Symbol" w:cs="Symbol"/>
+      </w:rPr>
+      <w:start w:val="1"/>
+      <w:suff w:val="tab"/>
+    </w:lvl>
+    <w:lvl w:ilvl="7">
+      <w:isLgl w:val="false"/>
+      <w:lvlJc w:val="left"/>
+      <w:lvlText w:val="o"/>
+      <w:numFmt w:val="bullet"/>
+      <w:pPr>
+        <w:pBdr/>
+        <w:spacing/>
+        <w:ind w:hanging="360" w:left="5749"/>
+      </w:pPr>
+      <w:rPr>
+        <w:rFonts w:hint="default" w:ascii="Courier New" w:hAnsi="Courier New" w:eastAsia="Courier New" w:cs="Courier New"/>
+      </w:rPr>
+      <w:start w:val="1"/>
+      <w:suff w:val="tab"/>
+    </w:lvl>
+    <w:lvl w:ilvl="8">
+      <w:isLgl w:val="false"/>
+      <w:lvlJc w:val="left"/>
+      <w:lvlText w:val="§"/>
+      <w:numFmt w:val="bullet"/>
+      <w:pPr>
+        <w:pBdr/>
+        <w:spacing/>
+        <w:ind w:hanging="360" w:left="6469"/>
+      </w:pPr>
+      <w:rPr>
+        <w:rFonts w:hint="default" w:ascii="Wingdings" w:hAnsi="Wingdings" w:eastAsia="Wingdings" w:cs="Wingdings"/>
+      </w:rPr>
+      <w:start w:val="1"/>
+      <w:suff w:val="tab"/>
+    </w:lvl>
+  </w:abstractNum>
+  <w:abstractNum w:abstractNumId="10">
+    <w:nsid w:val="3353E8EE"/>
+    <w:lvl w:ilvl="0">
+      <w:isLgl w:val="false"/>
+      <w:lvlJc w:val="left"/>
+      <w:lvlText w:val="–"/>
+      <w:numFmt w:val="bullet"/>
+      <w:pPr>
+        <w:pBdr/>
+        <w:spacing/>
+        <w:ind w:hanging="360" w:left="709"/>
+      </w:pPr>
+      <w:rPr>
+        <w:rFonts w:hint="default" w:ascii="Arial" w:hAnsi="Arial" w:eastAsia="Arial" w:cs="Arial"/>
+      </w:rPr>
+      <w:start w:val="1"/>
+      <w:suff w:val="tab"/>
+    </w:lvl>
+    <w:lvl w:ilvl="1">
+      <w:isLgl w:val="false"/>
+      <w:lvlJc w:val="left"/>
+      <w:lvlText w:val="o"/>
+      <w:numFmt w:val="bullet"/>
+      <w:pPr>
+        <w:pBdr/>
+        <w:spacing/>
+        <w:ind w:hanging="360" w:left="1429"/>
+      </w:pPr>
+      <w:rPr>
+        <w:rFonts w:hint="default" w:ascii="Courier New" w:hAnsi="Courier New" w:eastAsia="Courier New" w:cs="Courier New"/>
+      </w:rPr>
+      <w:start w:val="1"/>
+      <w:suff w:val="tab"/>
+    </w:lvl>
+    <w:lvl w:ilvl="2">
+      <w:isLgl w:val="false"/>
+      <w:lvlJc w:val="left"/>
+      <w:lvlText w:val="§"/>
+      <w:numFmt w:val="bullet"/>
+      <w:pPr>
+        <w:pBdr/>
+        <w:spacing/>
+        <w:ind w:hanging="360" w:left="2149"/>
+      </w:pPr>
+      <w:rPr>
+        <w:rFonts w:hint="default" w:ascii="Wingdings" w:hAnsi="Wingdings" w:eastAsia="Wingdings" w:cs="Wingdings"/>
+      </w:rPr>
+      <w:start w:val="1"/>
+      <w:suff w:val="tab"/>
+    </w:lvl>
+    <w:lvl w:ilvl="3">
+      <w:isLgl w:val="false"/>
+      <w:lvlJc w:val="left"/>
+      <w:lvlText w:val="·"/>
+      <w:numFmt w:val="bullet"/>
+      <w:pPr>
+        <w:pBdr/>
+        <w:spacing/>
+        <w:ind w:hanging="360" w:left="2869"/>
+      </w:pPr>
+      <w:rPr>
+        <w:rFonts w:hint="default" w:ascii="Symbol" w:hAnsi="Symbol" w:eastAsia="Symbol" w:cs="Symbol"/>
+      </w:rPr>
+      <w:start w:val="1"/>
+      <w:suff w:val="tab"/>
+    </w:lvl>
+    <w:lvl w:ilvl="4">
+      <w:isLgl w:val="false"/>
+      <w:lvlJc w:val="left"/>
+      <w:lvlText w:val="o"/>
+      <w:numFmt w:val="bullet"/>
+      <w:pPr>
+        <w:pBdr/>
+        <w:spacing/>
+        <w:ind w:hanging="360" w:left="3589"/>
+      </w:pPr>
+      <w:rPr>
+        <w:rFonts w:hint="default" w:ascii="Courier New" w:hAnsi="Courier New" w:eastAsia="Courier New" w:cs="Courier New"/>
+      </w:rPr>
+      <w:start w:val="1"/>
+      <w:suff w:val="tab"/>
+    </w:lvl>
+    <w:lvl w:ilvl="5">
+      <w:isLgl w:val="false"/>
+      <w:lvlJc w:val="left"/>
+      <w:lvlText w:val="§"/>
+      <w:numFmt w:val="bullet"/>
+      <w:pPr>
+        <w:pBdr/>
+        <w:spacing/>
+        <w:ind w:hanging="360" w:left="4309"/>
+      </w:pPr>
+      <w:rPr>
+        <w:rFonts w:hint="default" w:ascii="Wingdings" w:hAnsi="Wingdings" w:eastAsia="Wingdings" w:cs="Wingdings"/>
+      </w:rPr>
+      <w:start w:val="1"/>
+      <w:suff w:val="tab"/>
+    </w:lvl>
+    <w:lvl w:ilvl="6">
+      <w:isLgl w:val="false"/>
+      <w:lvlJc w:val="left"/>
+      <w:lvlText w:val="·"/>
+      <w:numFmt w:val="bullet"/>
+      <w:pPr>
+        <w:pBdr/>
+        <w:spacing/>
+        <w:ind w:hanging="360" w:left="5029"/>
+      </w:pPr>
+      <w:rPr>
+        <w:rFonts w:hint="default" w:ascii="Symbol" w:hAnsi="Symbol" w:eastAsia="Symbol" w:cs="Symbol"/>
+      </w:rPr>
+      <w:start w:val="1"/>
+      <w:suff w:val="tab"/>
+    </w:lvl>
+    <w:lvl w:ilvl="7">
+      <w:isLgl w:val="false"/>
+      <w:lvlJc w:val="left"/>
+      <w:lvlText w:val="o"/>
+      <w:numFmt w:val="bullet"/>
+      <w:pPr>
+        <w:pBdr/>
+        <w:spacing/>
+        <w:ind w:hanging="360" w:left="5749"/>
+      </w:pPr>
+      <w:rPr>
+        <w:rFonts w:hint="default" w:ascii="Courier New" w:hAnsi="Courier New" w:eastAsia="Courier New" w:cs="Courier New"/>
+      </w:rPr>
+      <w:start w:val="1"/>
+      <w:suff w:val="tab"/>
+    </w:lvl>
+    <w:lvl w:ilvl="8">
+      <w:isLgl w:val="false"/>
+      <w:lvlJc w:val="left"/>
+      <w:lvlText w:val="§"/>
+      <w:numFmt w:val="bullet"/>
+      <w:pPr>
+        <w:pBdr/>
+        <w:spacing/>
+        <w:ind w:hanging="360" w:left="6469"/>
+      </w:pPr>
+      <w:rPr>
+        <w:rFonts w:hint="default" w:ascii="Wingdings" w:hAnsi="Wingdings" w:eastAsia="Wingdings" w:cs="Wingdings"/>
+      </w:rPr>
+      <w:start w:val="1"/>
+      <w:suff w:val="tab"/>
+    </w:lvl>
+  </w:abstractNum>
+  <w:abstractNum w:abstractNumId="11">
+    <w:nsid w:val="72E9ABC1"/>
+    <w:lvl w:ilvl="0">
+      <w:isLgl w:val="false"/>
+      <w:lvlJc w:val="left"/>
+      <w:lvlText w:val="–"/>
+      <w:numFmt w:val="bullet"/>
+      <w:pPr>
+        <w:pBdr/>
+        <w:spacing/>
+        <w:ind w:hanging="360" w:left="709"/>
+      </w:pPr>
+      <w:rPr>
+        <w:rFonts w:hint="default" w:ascii="Arial" w:hAnsi="Arial" w:eastAsia="Arial" w:cs="Arial"/>
+      </w:rPr>
+      <w:start w:val="1"/>
+      <w:suff w:val="tab"/>
+    </w:lvl>
+    <w:lvl w:ilvl="1">
+      <w:isLgl w:val="false"/>
+      <w:lvlJc w:val="left"/>
+      <w:lvlText w:val="o"/>
+      <w:numFmt w:val="bullet"/>
+      <w:pPr>
+        <w:pBdr/>
+        <w:spacing/>
+        <w:ind w:hanging="360" w:left="1429"/>
+      </w:pPr>
+      <w:rPr>
+        <w:rFonts w:hint="default" w:ascii="Courier New" w:hAnsi="Courier New" w:eastAsia="Courier New" w:cs="Courier New"/>
+      </w:rPr>
+      <w:start w:val="1"/>
+      <w:suff w:val="tab"/>
+    </w:lvl>
+    <w:lvl w:ilvl="2">
+      <w:isLgl w:val="false"/>
+      <w:lvlJc w:val="left"/>
+      <w:lvlText w:val="§"/>
+      <w:numFmt w:val="bullet"/>
+      <w:pPr>
+        <w:pBdr/>
+        <w:spacing/>
+        <w:ind w:hanging="360" w:left="2149"/>
+      </w:pPr>
+      <w:rPr>
+        <w:rFonts w:hint="default" w:ascii="Wingdings" w:hAnsi="Wingdings" w:eastAsia="Wingdings" w:cs="Wingdings"/>
+      </w:rPr>
+      <w:start w:val="1"/>
+      <w:suff w:val="tab"/>
+    </w:lvl>
+    <w:lvl w:ilvl="3">
+      <w:isLgl w:val="false"/>
+      <w:lvlJc w:val="left"/>
+      <w:lvlText w:val="·"/>
+      <w:numFmt w:val="bullet"/>
+      <w:pPr>
+        <w:pBdr/>
+        <w:spacing/>
+        <w:ind w:hanging="360" w:left="2869"/>
+      </w:pPr>
+      <w:rPr>
+        <w:rFonts w:hint="default" w:ascii="Symbol" w:hAnsi="Symbol" w:eastAsia="Symbol" w:cs="Symbol"/>
+      </w:rPr>
+      <w:start w:val="1"/>
+      <w:suff w:val="tab"/>
+    </w:lvl>
+    <w:lvl w:ilvl="4">
+      <w:isLgl w:val="false"/>
+      <w:lvlJc w:val="left"/>
+      <w:lvlText w:val="o"/>
+      <w:numFmt w:val="bullet"/>
+      <w:pPr>
+        <w:pBdr/>
+        <w:spacing/>
+        <w:ind w:hanging="360" w:left="3589"/>
+      </w:pPr>
+      <w:rPr>
+        <w:rFonts w:hint="default" w:ascii="Courier New" w:hAnsi="Courier New" w:eastAsia="Courier New" w:cs="Courier New"/>
+      </w:rPr>
+      <w:start w:val="1"/>
+      <w:suff w:val="tab"/>
+    </w:lvl>
+    <w:lvl w:ilvl="5">
+      <w:isLgl w:val="false"/>
+      <w:lvlJc w:val="left"/>
+      <w:lvlText w:val="§"/>
+      <w:numFmt w:val="bullet"/>
+      <w:pPr>
+        <w:pBdr/>
+        <w:spacing/>
+        <w:ind w:hanging="360" w:left="4309"/>
+      </w:pPr>
+      <w:rPr>
+        <w:rFonts w:hint="default" w:ascii="Wingdings" w:hAnsi="Wingdings" w:eastAsia="Wingdings" w:cs="Wingdings"/>
+      </w:rPr>
+      <w:start w:val="1"/>
+      <w:suff w:val="tab"/>
+    </w:lvl>
+    <w:lvl w:ilvl="6">
+      <w:isLgl w:val="false"/>
+      <w:lvlJc w:val="left"/>
+      <w:lvlText w:val="·"/>
+      <w:numFmt w:val="bullet"/>
+      <w:pPr>
+        <w:pBdr/>
+        <w:spacing/>
+        <w:ind w:hanging="360" w:left="5029"/>
+      </w:pPr>
+      <w:rPr>
+        <w:rFonts w:hint="default" w:ascii="Symbol" w:hAnsi="Symbol" w:eastAsia="Symbol" w:cs="Symbol"/>
+      </w:rPr>
+      <w:start w:val="1"/>
+      <w:suff w:val="tab"/>
+    </w:lvl>
+    <w:lvl w:ilvl="7">
+      <w:isLgl w:val="false"/>
+      <w:lvlJc w:val="left"/>
+      <w:lvlText w:val="o"/>
+      <w:numFmt w:val="bullet"/>
+      <w:pPr>
+        <w:pBdr/>
+        <w:spacing/>
+        <w:ind w:hanging="360" w:left="5749"/>
+      </w:pPr>
+      <w:rPr>
+        <w:rFonts w:hint="default" w:ascii="Courier New" w:hAnsi="Courier New" w:eastAsia="Courier New" w:cs="Courier New"/>
+      </w:rPr>
+      <w:start w:val="1"/>
+      <w:suff w:val="tab"/>
+    </w:lvl>
+    <w:lvl w:ilvl="8">
+      <w:isLgl w:val="false"/>
+      <w:lvlJc w:val="left"/>
+      <w:lvlText w:val="§"/>
+      <w:numFmt w:val="bullet"/>
+      <w:pPr>
+        <w:pBdr/>
+        <w:spacing/>
+        <w:ind w:hanging="360" w:left="6469"/>
+      </w:pPr>
+      <w:rPr>
+        <w:rFonts w:hint="default" w:ascii="Wingdings" w:hAnsi="Wingdings" w:eastAsia="Wingdings" w:cs="Wingdings"/>
+      </w:rPr>
+      <w:start w:val="1"/>
+      <w:suff w:val="tab"/>
+    </w:lvl>
+  </w:abstractNum>
+  <w:abstractNum w:abstractNumId="12">
+    <w:nsid w:val="1E582120"/>
+    <w:lvl w:ilvl="0">
+      <w:isLgl w:val="false"/>
+      <w:lvlJc w:val="left"/>
+      <w:lvlText w:val="–"/>
+      <w:numFmt w:val="bullet"/>
+      <w:pPr>
+        <w:pBdr/>
+        <w:spacing/>
+        <w:ind w:hanging="360" w:left="709"/>
+      </w:pPr>
+      <w:rPr>
+        <w:rFonts w:hint="default" w:ascii="Arial" w:hAnsi="Arial" w:eastAsia="Arial" w:cs="Arial"/>
+      </w:rPr>
+      <w:start w:val="1"/>
+      <w:suff w:val="tab"/>
+    </w:lvl>
+    <w:lvl w:ilvl="1">
+      <w:isLgl w:val="false"/>
+      <w:lvlJc w:val="left"/>
+      <w:lvlText w:val="o"/>
+      <w:numFmt w:val="bullet"/>
+      <w:pPr>
+        <w:pBdr/>
+        <w:spacing/>
+        <w:ind w:hanging="360" w:left="1429"/>
+      </w:pPr>
+      <w:rPr>
+        <w:rFonts w:hint="default" w:ascii="Courier New" w:hAnsi="Courier New" w:eastAsia="Courier New" w:cs="Courier New"/>
+      </w:rPr>
+      <w:start w:val="1"/>
+      <w:suff w:val="tab"/>
+    </w:lvl>
+    <w:lvl w:ilvl="2">
+      <w:isLgl w:val="false"/>
+      <w:lvlJc w:val="left"/>
+      <w:lvlText w:val="§"/>
+      <w:numFmt w:val="bullet"/>
+      <w:pPr>
+        <w:pBdr/>
+        <w:spacing/>
+        <w:ind w:hanging="360" w:left="2149"/>
+      </w:pPr>
+      <w:rPr>
+        <w:rFonts w:hint="default" w:ascii="Wingdings" w:hAnsi="Wingdings" w:eastAsia="Wingdings" w:cs="Wingdings"/>
+      </w:rPr>
+      <w:start w:val="1"/>
+      <w:suff w:val="tab"/>
+    </w:lvl>
+    <w:lvl w:ilvl="3">
+      <w:isLgl w:val="false"/>
+      <w:lvlJc w:val="left"/>
+      <w:lvlText w:val="·"/>
+      <w:numFmt w:val="bullet"/>
+      <w:pPr>
+        <w:pBdr/>
+        <w:spacing/>
+        <w:ind w:hanging="360" w:left="2869"/>
+      </w:pPr>
+      <w:rPr>
+        <w:rFonts w:hint="default" w:ascii="Symbol" w:hAnsi="Symbol" w:eastAsia="Symbol" w:cs="Symbol"/>
+      </w:rPr>
+      <w:start w:val="1"/>
+      <w:suff w:val="tab"/>
+    </w:lvl>
+    <w:lvl w:ilvl="4">
+      <w:isLgl w:val="false"/>
+      <w:lvlJc w:val="left"/>
+      <w:lvlText w:val="o"/>
+      <w:numFmt w:val="bullet"/>
+      <w:pPr>
+        <w:pBdr/>
+        <w:spacing/>
+        <w:ind w:hanging="360" w:left="3589"/>
+      </w:pPr>
+      <w:rPr>
+        <w:rFonts w:hint="default" w:ascii="Courier New" w:hAnsi="Courier New" w:eastAsia="Courier New" w:cs="Courier New"/>
+      </w:rPr>
+      <w:start w:val="1"/>
+      <w:suff w:val="tab"/>
+    </w:lvl>
+    <w:lvl w:ilvl="5">
+      <w:isLgl w:val="false"/>
+      <w:lvlJc w:val="left"/>
+      <w:lvlText w:val="§"/>
+      <w:numFmt w:val="bullet"/>
+      <w:pPr>
+        <w:pBdr/>
+        <w:spacing/>
+        <w:ind w:hanging="360" w:left="4309"/>
+      </w:pPr>
+      <w:rPr>
+        <w:rFonts w:hint="default" w:ascii="Wingdings" w:hAnsi="Wingdings" w:eastAsia="Wingdings" w:cs="Wingdings"/>
+      </w:rPr>
+      <w:start w:val="1"/>
+      <w:suff w:val="tab"/>
+    </w:lvl>
+    <w:lvl w:ilvl="6">
+      <w:isLgl w:val="false"/>
+      <w:lvlJc w:val="left"/>
+      <w:lvlText w:val="·"/>
+      <w:numFmt w:val="bullet"/>
+      <w:pPr>
+        <w:pBdr/>
+        <w:spacing/>
+        <w:ind w:hanging="360" w:left="5029"/>
+      </w:pPr>
+      <w:rPr>
+        <w:rFonts w:hint="default" w:ascii="Symbol" w:hAnsi="Symbol" w:eastAsia="Symbol" w:cs="Symbol"/>
+      </w:rPr>
+      <w:start w:val="1"/>
+      <w:suff w:val="tab"/>
+    </w:lvl>
+    <w:lvl w:ilvl="7">
+      <w:isLgl w:val="false"/>
+      <w:lvlJc w:val="left"/>
+      <w:lvlText w:val="o"/>
+      <w:numFmt w:val="bullet"/>
+      <w:pPr>
+        <w:pBdr/>
+        <w:spacing/>
+        <w:ind w:hanging="360" w:left="5749"/>
+      </w:pPr>
+      <w:rPr>
+        <w:rFonts w:hint="default" w:ascii="Courier New" w:hAnsi="Courier New" w:eastAsia="Courier New" w:cs="Courier New"/>
+      </w:rPr>
+      <w:start w:val="1"/>
+      <w:suff w:val="tab"/>
+    </w:lvl>
+    <w:lvl w:ilvl="8">
+      <w:isLgl w:val="false"/>
+      <w:lvlJc w:val="left"/>
+      <w:lvlText w:val="§"/>
+      <w:numFmt w:val="bullet"/>
+      <w:pPr>
+        <w:pBdr/>
+        <w:spacing/>
+        <w:ind w:hanging="360" w:left="6469"/>
+      </w:pPr>
+      <w:rPr>
+        <w:rFonts w:hint="default" w:ascii="Wingdings" w:hAnsi="Wingdings" w:eastAsia="Wingdings" w:cs="Wingdings"/>
+      </w:rPr>
+      <w:start w:val="1"/>
+      <w:suff w:val="tab"/>
+    </w:lvl>
+  </w:abstractNum>
   <w:num w:numId="1">
     <w:abstractNumId w:val="0"/>
   </w:num>
@@ -1482,6 +3679,30 @@
   </w:num>
   <w:num w:numId="5">
     <w:abstractNumId w:val="4"/>
+  </w:num>
+  <w:num w:numId="6">
+    <w:abstractNumId w:val="5"/>
+  </w:num>
+  <w:num w:numId="7">
+    <w:abstractNumId w:val="6"/>
+  </w:num>
+  <w:num w:numId="8">
+    <w:abstractNumId w:val="7"/>
+  </w:num>
+  <w:num w:numId="9">
+    <w:abstractNumId w:val="8"/>
+  </w:num>
+  <w:num w:numId="10">
+    <w:abstractNumId w:val="9"/>
+  </w:num>
+  <w:num w:numId="11">
+    <w:abstractNumId w:val="10"/>
+  </w:num>
+  <w:num w:numId="12">
+    <w:abstractNumId w:val="11"/>
+  </w:num>
+  <w:num w:numId="13">
+    <w:abstractNumId w:val="12"/>
   </w:num>
 </w:numbering>
 </file>

</xml_diff>